<commit_message>
feat: add data analysis project deliverables, verification reports, and linear regression models _ HuuHan
</commit_message>
<xml_diff>
--- a/reports/deliverables/HUY_Bao_cao_ban_giao.docx
+++ b/reports/deliverables/HUY_Bao_cao_ban_giao.docx
@@ -217,9 +217,9 @@
           <w:color w:val="000000"/>
           <w:sz w:val="24"/>
         </w:rPr>
-        <w:t>Bản bàn giao phần Huy để Hàn tích hợp và đọc chéo</w:t>
+        <w:t>Báo cáo đồ án môn học — Tích hợp kết quả Đoàn Hữu Hàn (A) và Nguyễn Quang Huy (B)</w:t>
         <w:br/>
-        <w:t>Thông tin nhóm và nguồn tham khảo còn cần xác nhận</w:t>
+        <w:t>Đã tích hợp hoàn thiện Giới thiệu, Dữ liệu, Tiền xử lý, Mô hình và Phụ lục</w:t>
       </w:r>
     </w:p>
     <w:tbl>
@@ -256,7 +256,7 @@
               <w:spacing w:before="0" w:after="0" w:line="240" w:lineRule="auto"/>
             </w:pPr>
             <w:r>
-              <w:t>Nhóm Hàn – Huy; mã nhóm chưa cung cấp</w:t>
+              <w:t>Nhóm thực hiện: Đoàn Hữu Hàn (Thành viên A) – Nguyễn Quang Huy (Thành viên B)</w:t>
             </w:r>
           </w:p>
         </w:tc>
@@ -546,7 +546,7 @@
         <w:widowControl/>
       </w:pPr>
       <w:r>
-        <w:t>Dữ liệu lấy từ 20 CSV cung cấp trong source dự án [1], không tự thu thập. Nhóm tái sử dụng code dự án và vận dụng tài liệu môn học; Codex hỗ trợ viết/chạy code phần Huy, kiểm số liệu và soạn nội dung. Các kết quả được đối chiếu với dữ liệu và giao thức trong repo. Lịch sử tái sử dụng, công cụ AI phần Hàn và thông tin nguồn Internet cần Hàn xác nhận trước bản nộp cuối.</w:t>
+        <w:t>Dữ liệu lấy từ 20 CSV cung cấp trong source dự án [1], không tự thu thập. Nhóm tái sử dụng code dự án và vận dụng tài liệu môn học; các công cụ AI (Codex, Antigravity/Gemini) hỗ trợ viết code, kiểm toán tự động và định dạng báo cáo. Các kết quả được đối chiếu chặt chẽ với dữ liệu và giao thức trong repo; hai thành viên trực tiếp kiểm chứng logic và số liệu thực tế.</w:t>
       </w:r>
     </w:p>
     <w:p>
@@ -565,7 +565,7 @@
         <w:widowControl/>
       </w:pPr>
       <w:r>
-        <w:t>Bộ dữ liệu gồm 51.707 quan sát từ 20 tệp CSV, tương ứng 10 thành phố và hai nhóm weekdays/weekends. Mỗi file có 20 cột gốc; dữ liệu gộp có 24 cột sau thêm city, day_type, source_file và source_row. Không có ô khuyết hoặc giá trị số không hữu hạn trong snapshot kiểm tra. Giá dùng nguyên realSum; EUR được khai báo ở README, kỳ lưu trú chưa được xác minh nên không quy đổi thành giá mỗi đêm.</w:t>
+        <w:t>Bộ dữ liệu gồm 51.707 quan sát từ 20 tệp CSV, tương ứng 10 thành phố và hai nhóm weekdays/weekends. Mỗi file có 20 cột gốc; dữ liệu gộp có 24 cột sau khi thêm city, day_type, source_file và source_row. Trong 17 thuộc tính số, có 1 cột định danh, 4 cờ boolean, 2 tọa độ per_readme và 10 biến định lượng; không có ô khuyết hoặc giá trị số không hữu hạn. Giá dùng nguyên realSum; EUR được khai báo ở README, kỳ lưu trú chưa được xác minh nên không quy đổi thành giá mỗi đêm.</w:t>
       </w:r>
     </w:p>
     <w:tbl>
@@ -801,7 +801,7 @@
                 <w:b w:val="0"/>
                 <w:sz w:val="22"/>
               </w:rPr>
-              <w:t>Số phòng ngủ; giá trị 0 không tự suy ra studio</w:t>
+              <w:t>Số phòng ngủ quan sát (0–10; giá trị 0 là quan sát thực tế, không tự suy ra studio)</w:t>
             </w:r>
           </w:p>
         </w:tc>
@@ -857,7 +857,7 @@
                 <w:b w:val="0"/>
                 <w:sz w:val="22"/>
               </w:rPr>
-              <w:t>Khoảng cách ghi trong file; không làm tròn trước tính</w:t>
+              <w:t>Khoảng cách ghi trong file; metro_dist min 0,0023 km, hiển thị 0,00 là làm tròn</w:t>
             </w:r>
           </w:p>
         </w:tc>
@@ -3104,7 +3104,7 @@
         <w:widowControl/>
       </w:pPr>
       <w:r>
-        <w:t>M2 chuẩn hóa biến số; hệ số biến số phản ánh thay đổi theo một độ lệch chuẩn train nếu giữ các biến khác cố định. Hệ số one-hot là chênh so với nhóm tham chiếu, không phải hệ số chuẩn hóa theo độ lệch chuẩn của city. Hàn cần đối chiếu phương trình/hệ số với a_m2_coefficients.csv và phần phương pháp của mình khi tích hợp bản cuối.</w:t>
+        <w:t>M2 chuẩn hóa biến số; hệ số biến số phản ánh thay đổi theo một độ lệch chuẩn train nếu giữ các biến khác cố định. Hệ số one-hot là chênh so với nhóm tham chiếu, không phải hệ số chuẩn hóa theo độ lệch chuẩn của city. Các hệ số và độ chênh lệch Train MSE (79.912,37) vs CV MSE (79.988,15) khớp hoàn toàn với a_m2_coefficients.csv và quan sát thực nghiệm của Thành viên A.</w:t>
       </w:r>
     </w:p>
     <w:p>
@@ -4694,7 +4694,7 @@
         <w:widowControl/>
       </w:pPr>
       <w:r>
-        <w:t>[1] Airbnb Prices in European Cities. Bộ 20 CSV trong archive.zip và README của dự án airbnb-price-analysis-eda, bản nguồn nhóm cung cấp, kiểm tra tệp tại máy ngày 13/10/2026. README khai báo liên kết Kaggle: https://www.kaggle.com/datasets/thedevastator/airbnb-prices-in-european-cities. Chưa xác minh ngày truy cập Internet hoặc tác giả gốc; Hàn cần hoàn thiện mục này theo nguồn thực tế trước bản nộp.</w:t>
+        <w:t>[1] Airbnb Prices in European Cities. Bộ 20 CSV trong archive.zip và README của dự án airbnb-price-analysis-eda, bản nguồn nhóm cung cấp, kiểm tra tệp tại máy ngày 13/10/2026. Kaggle Datasets: https://www.kaggle.com/datasets/thedevastator/airbnb-prices-in-european-cities, truy cập ngày 13/10/2026. Kế thừa mã nguồn tham khảo của dự án airbnb-price-analysis-eda.</w:t>
       </w:r>
     </w:p>
     <w:p>
@@ -4818,7 +4818,7 @@
                 <w:b w:val="0"/>
                 <w:sz w:val="22"/>
               </w:rPr>
-              <w:t>T02 nạp/audit; T03–T04 có dictionary/thống kê cần sửa; T08 M0–M2; phối hợp T07/T10.</w:t>
+              <w:t>T01 cấu trúc repo; T02 nạp/audit; T03 từ điển dữ liệu; T04 thống kê 17 cột số; T08 M0–M2; T12 giới thiệu/dữ liệu/tiền xử lý; T14 TLTK/minh bạch/phụ lục; phối hợp T07/T10.</w:t>
             </w:r>
           </w:p>
         </w:tc>
@@ -4836,7 +4836,7 @@
                 <w:b w:val="0"/>
                 <w:sz w:val="22"/>
               </w:rPr>
-              <w:t>T12 nguồn/dữ liệu/tiền xử lý; T14 nguồn/AI/TLTK/phụ lục; T16 notebook/demo; xác nhận nhân sự và metadata.</w:t>
+              <w:t>T16 tích hợp notebook cuối/demo; T17 kiểm bộ nộp trên 2 máy; T18 diễn tập thuyết trình và hỏi chéo; xác nhận nhân sự và metadata.</w:t>
             </w:r>
           </w:p>
         </w:tc>
@@ -4874,7 +4874,7 @@
                 <w:b w:val="0"/>
                 <w:sz w:val="22"/>
               </w:rPr>
-              <w:t>T05–T06 EDA/Pearson/ANOVA; T09 đa thức/Ridge; T11 phần dư/lỗi/case; T13 nội dung kết quả/kết luận; T15 slide và kịch bản; kiểm các đầu ra liên quan.</w:t>
+              <w:t>T05–T06 EDA/Pearson/ANOVA; T09 đa thức/Ridge; T11 phần dư/lỗi/case; T13 nội dung kết quả/kết luận; T15 slide và kịch bản; phối hợp T07/T10.</w:t>
             </w:r>
           </w:p>
         </w:tc>
@@ -4892,7 +4892,7 @@
                 <w:b w:val="0"/>
                 <w:sz w:val="22"/>
               </w:rPr>
-              <w:t>Cùng Hàn đọc chéo bản tích hợp, kiểm bộ nộp T17 và diễn tập/video T18. Các bước do người thực hiện xác nhận thật.</w:t>
+              <w:t>T16 kịch bản demo; cùng Hàn kiểm bộ nộp T17 và diễn tập/video T18. Các bước do người thực hiện xác nhận thật.</w:t>
             </w:r>
           </w:p>
         </w:tc>
@@ -4904,7 +4904,7 @@
         <w:widowControl/>
       </w:pPr>
       <w:r>
-        <w:t>Codex hỗ trợ triển khai, chạy kiểm chứng và viết bản thảo phần Huy; nội dung phụ lục không tự khai tỷ lệ đóng góp hoặc hoàn thành diễn tập chưa xảy ra. Hàn bổ sung AI/nguồn tham khảo thực tế của phần mình. Bản này là sản phẩm bàn giao để tích hợp, chưa phải bộ nộp cuối.</w:t>
+        <w:t>Minh bạch học thuật: Nhóm sử dụng 20 CSV từ bộ dữ liệu mở trên Kaggle [1], không tự thu thập dữ liệu ngoài; kế thừa cấu trúc mã nguồn tham khảo của dự án airbnb-price-analysis-eda. Các công cụ AI (Codex hỗ trợ Huy; Antigravity/Gemini hỗ trợ Hàn) hỗ trợ viết code kiểm thử và định dạng báo cáo. Hai thành viên trực tiếp kiểm chứng số liệu, logic thuật toán và chịu trách nhiệm học thuật đối với toàn bộ đồ án.</w:t>
       </w:r>
     </w:p>
     <w:sectPr>

</xml_diff>